<commit_message>
Samakan posisi sampul Proposal, Seminar Hasil, dan Skripsi
Co-Authored-By: Claude Sonnet 5.5 <noreply@anthropic.com>
</commit_message>
<xml_diff>
--- a/contoh/hasil/proposal.docx
+++ b/contoh/hasil/proposal.docx
@@ -37,6 +37,12 @@
         </w:rPr>
         <w:t xml:space="preserve">ANALISIS KINERJA ALGORITMA PENJADWALAN PAKET PADA JARINGAN LTE MENGGUNAKAN SIMULATOR NS-3</w:t>
       </w:r>
+    </w:p>
+    <w:p>
+      <w:pPr>
+        <w:pStyle w:val="Tengah"/>
+        <w:spacing w:before="0" w:after="0" w:line="1060" w:lineRule="exact"/>
+      </w:pPr>
     </w:p>
     <w:p>
       <w:pPr>

</xml_diff>

<commit_message>
Rapikan formulir pengajuan judul; lembar persetujuan; daftar lampiran; analisis format di panduan
- formulir: satu tabel kotak penuh per usulan, satu halaman per usulan, halaman verifikasi
- lembar persetujuan: Nama, NPM, Program Studi (satu baris); ruang tanda tangan +3 baris
- pengesahan dan keaslian tanpa nomor halaman; abstrak = i
- daftar lampiran pada skripsi dan seminar hasil (LaTeX dan Word)
- proposal: rumusan masalah dan tujuan berbutir bernomor
- font rumus Termes Math; widow/club penalty; daftar tabel/gambar serasi dengan daftar isi
- panduan: bagian formulir, dosen/peran, dan analisis kesesuaian dokumen asli (bagian 14)

Co-Authored-By: Claude Sonnet 5.5 <noreply@anthropic.com>
</commit_message>
<xml_diff>
--- a/contoh/hasil/proposal.docx
+++ b/contoh/hasil/proposal.docx
@@ -231,9 +231,9 @@
         <w:tblLook w:firstRow="0" w:lastRow="0" w:firstColumn="0" w:lastColumn="0" w:noHBand="0" w:noVBand="0" w:val="0000"/>
       </w:tblPr>
       <w:tblGrid>
-        <w:gridCol w:w="1267"/>
+        <w:gridCol w:w="1742"/>
         <w:gridCol w:w="316"/>
-        <w:gridCol w:w="5860"/>
+        <w:gridCol w:w="5385"/>
       </w:tblGrid>
       <w:tr>
         <w:trPr>
@@ -332,24 +332,18 @@
           <w:p>
             <w:pPr>
               <w:pStyle w:val="Compact"/>
-              <w:keepNext/>
-              <w:jc w:val="left"/>
-            </w:pPr>
-            <w:r>
-              <w:rPr>
-                <w:i/>
-                <w:iCs/>
-              </w:rPr>
-              <w:t xml:space="preserve">Contact</w:t>
-            </w:r>
-          </w:p>
-        </w:tc>
-        <w:tc>
-          <w:tcPr/>
-          <w:p>
-            <w:pPr>
-              <w:pStyle w:val="Compact"/>
-              <w:keepNext/>
+              <w:jc w:val="left"/>
+            </w:pPr>
+            <w:r>
+              <w:t xml:space="preserve">Program Studi</w:t>
+            </w:r>
+          </w:p>
+        </w:tc>
+        <w:tc>
+          <w:tcPr/>
+          <w:p>
+            <w:pPr>
+              <w:pStyle w:val="Compact"/>
               <w:jc w:val="left"/>
             </w:pPr>
             <w:r>
@@ -362,80 +356,10 @@
           <w:p>
             <w:pPr>
               <w:pStyle w:val="Compact"/>
-              <w:keepNext/>
-              <w:jc w:val="left"/>
-            </w:pPr>
-            <w:r>
-              <w:t xml:space="preserve">Jl. Contoh No. 1, Baubau</w:t>
-            </w:r>
-          </w:p>
-        </w:tc>
-      </w:tr>
-      <w:tr>
-        <w:trPr>
-          <w:cantSplit/>
-        </w:trPr>
-        <w:tc>
-          <w:tcPr/>
-          <w:p>
-            <w:pPr>
-              <w:pStyle w:val="Compact"/>
-              <w:keepNext/>
-            </w:pPr>
-          </w:p>
-        </w:tc>
-        <w:tc>
-          <w:tcPr/>
-          <w:p>
-            <w:pPr>
-              <w:pStyle w:val="Compact"/>
-              <w:keepNext/>
-            </w:pPr>
-          </w:p>
-        </w:tc>
-        <w:tc>
-          <w:tcPr/>
-          <w:p>
-            <w:pPr>
-              <w:pStyle w:val="Compact"/>
-              <w:keepNext/>
-              <w:jc w:val="left"/>
-            </w:pPr>
-            <w:r>
-              <w:t xml:space="preserve">0812-0000-0000; contoh@example.ac.id</w:t>
-            </w:r>
-          </w:p>
-        </w:tc>
-      </w:tr>
-      <w:tr>
-        <w:trPr>
-          <w:cantSplit/>
-        </w:trPr>
-        <w:tc>
-          <w:tcPr/>
-          <w:p>
-            <w:pPr>
-              <w:pStyle w:val="Compact"/>
-            </w:pPr>
-          </w:p>
-        </w:tc>
-        <w:tc>
-          <w:tcPr/>
-          <w:p>
-            <w:pPr>
-              <w:pStyle w:val="Compact"/>
-            </w:pPr>
-          </w:p>
-        </w:tc>
-        <w:tc>
-          <w:tcPr/>
-          <w:p>
-            <w:pPr>
-              <w:pStyle w:val="Compact"/>
-              <w:jc w:val="left"/>
-            </w:pPr>
-            <w:r>
-              <w:t xml:space="preserve">(alamat, telepon, email untuk kemudahan menghubungi; dan jika ada perubahan data harap segera menghubungi Program Studi)</w:t>
+              <w:jc w:val="left"/>
+            </w:pPr>
+            <w:r>
+              <w:t xml:space="preserve">Rekayasa Sistem Komputer</w:t>
             </w:r>
           </w:p>
         </w:tc>
@@ -548,6 +472,24 @@
               <w:br/>
             </w:r>
             <w:r>
+              <w:t xml:space="preserve"> </w:t>
+            </w:r>
+            <w:r>
+              <w:br/>
+            </w:r>
+            <w:r>
+              <w:t xml:space="preserve"> </w:t>
+            </w:r>
+            <w:r>
+              <w:br/>
+            </w:r>
+            <w:r>
+              <w:t xml:space="preserve"> </w:t>
+            </w:r>
+            <w:r>
+              <w:br/>
+            </w:r>
+            <w:r>
               <w:rPr>
                 <w:sz w:val="21"/>
                 <w:szCs w:val="21"/>
@@ -575,6 +517,24 @@
                 <w:bCs/>
               </w:rPr>
               <w:t xml:space="preserve">Pembimbing II</w:t>
+            </w:r>
+            <w:r>
+              <w:br/>
+            </w:r>
+            <w:r>
+              <w:t xml:space="preserve"> </w:t>
+            </w:r>
+            <w:r>
+              <w:br/>
+            </w:r>
+            <w:r>
+              <w:t xml:space="preserve"> </w:t>
+            </w:r>
+            <w:r>
+              <w:br/>
+            </w:r>
+            <w:r>
+              <w:t xml:space="preserve"> </w:t>
             </w:r>
             <w:r>
               <w:br/>
@@ -780,7 +740,7 @@
         <w:fldChar w:fldCharType="begin" w:dirty="true"/>
       </w:r>
       <w:r>
-        <w:instrText xml:space="preserve"> TOC \h \z \t "Table Caption,1" </w:instrText>
+        <w:instrText xml:space="preserve"> TOC \h \z \t "Table Caption,2" </w:instrText>
       </w:r>
       <w:r>
         <w:fldChar w:fldCharType="separate"/>
@@ -808,7 +768,7 @@
         <w:fldChar w:fldCharType="begin" w:dirty="true"/>
       </w:r>
       <w:r>
-        <w:instrText xml:space="preserve"> TOC \h \z \t "Image Caption,1" </w:instrText>
+        <w:instrText xml:space="preserve"> TOC \h \z \t "Image Caption,2" </w:instrText>
       </w:r>
       <w:r>
         <w:fldChar w:fldCharType="separate"/>

</xml_diff>